<commit_message>
Manual certificates: no separate group, anyone in AllowedGroup
Whoever can issue certificates can issue one manually. ManualAllowedGroup
is gone from the config, the server and the docs; the manual routes sit
behind the same AllowedGroup check as everything else, and every
not-found message carries the link to the manual form.

Co-Authored-By: Claude Opus 5.5 <noreply@anthropic.com>
Claude-Session: https://claude.ai/code/session_01UqLdBgYZALtuoEpk76BV4i
</commit_message>
<xml_diff>
--- a/Apple-Certificate-Quick-Reference.docx
+++ b/Apple-Certificate-Quick-Reference.docx
@@ -93,7 +93,7 @@
               <w:spacing w:after="100"/>
               <w:jc w:val="center"/>
             </w:pPr>
-            <w:hyperlink w:history="1" r:id="rId2whvhzornlfrrzpkrg6mw">
+            <w:hyperlink w:history="1" r:id="rId5npm5zl3wf5qaesbpyw8i">
               <w:r>
                 <w:rPr>
                   <w:rFonts w:ascii="Consolas" w:cs="Consolas" w:eastAsia="Consolas" w:hAnsi="Consolas"/>
@@ -617,7 +617,7 @@
           <w:sz w:val="20"/>
           <w:szCs w:val="20"/>
         </w:rPr>
-        <w:t xml:space="preserve">Issue the certificate before releasing the device from Apple Business. A released device may no longer be found. Then only someone allowed to issue manual certificates can certify it, and the certificate says the details were entered manually.</w:t>
+        <w:t xml:space="preserve">Issue the certificate before releasing the device from Apple Business. A released device may no longer be found. Then use the link on the not-found message to enter the details manually; the certificate will say so.</w:t>
       </w:r>
     </w:p>
     <w:p>

</xml_diff>